<commit_message>
Update Painel RH PrcuradoresSp.docx
discription updated, map added
</commit_message>
<xml_diff>
--- a/Painel RH PrcuradoresSp.docx
+++ b/Painel RH PrcuradoresSp.docx
@@ -29,13 +29,24 @@
       </w:r>
       <w:r>
         <w:br/>
-        <w:t xml:space="preserve">objetivo : coletar dados de diversas fontes e </w:t>
+      </w:r>
+      <w:r>
+        <w:t>O</w:t>
+      </w:r>
+      <w:r>
+        <w:t xml:space="preserve">bjetivo : coletar dados de diversas fontes e </w:t>
       </w:r>
       <w:r>
         <w:t>criar modelagem dimensional dos dados</w:t>
       </w:r>
       <w:r>
-        <w:t xml:space="preserve">, criar dashboards que apresente informações gerenciais </w:t>
+        <w:t>, criar dashboards que apresent</w:t>
+      </w:r>
+      <w:r>
+        <w:t>em</w:t>
+      </w:r>
+      <w:r>
+        <w:t xml:space="preserve"> informações gerenciais </w:t>
       </w:r>
       <w:r>
         <w:t>sobre os colaboradores</w:t>
@@ -393,12 +404,36 @@
       </w:r>
     </w:p>
     <w:p/>
+    <w:p/>
+    <w:p/>
+    <w:p/>
+    <w:p/>
+    <w:p/>
+    <w:p/>
+    <w:p>
+      <w:r>
+        <w:lastRenderedPageBreak/>
+        <w:t xml:space="preserve">Menu expansível </w:t>
+      </w:r>
+      <w:r>
+        <w:t xml:space="preserve"> em todas as páginas.</w:t>
+      </w:r>
+      <w:r>
+        <w:br/>
+      </w:r>
+      <w:r>
+        <w:br/>
+        <w:t xml:space="preserve">disponibilizei duas versões da página unidades, uma preta e branca e </w:t>
+      </w:r>
+      <w:r>
+        <w:t>uma vermelha.</w:t>
+      </w:r>
+    </w:p>
     <w:p>
       <w:r>
         <w:rPr>
           <w:noProof/>
         </w:rPr>
-        <w:lastRenderedPageBreak/>
         <w:drawing>
           <wp:inline distT="0" distB="0" distL="0" distR="0" wp14:anchorId="1086C5CE" wp14:editId="100B12B2">
             <wp:extent cx="5400040" cy="3017520"/>
@@ -424,6 +459,49 @@
                     <a:xfrm>
                       <a:off x="0" y="0"/>
                       <a:ext cx="5400040" cy="3017520"/>
+                    </a:xfrm>
+                    <a:prstGeom prst="rect">
+                      <a:avLst/>
+                    </a:prstGeom>
+                  </pic:spPr>
+                </pic:pic>
+              </a:graphicData>
+            </a:graphic>
+          </wp:inline>
+        </w:drawing>
+      </w:r>
+    </w:p>
+    <w:p/>
+    <w:p>
+      <w:r>
+        <w:rPr>
+          <w:noProof/>
+        </w:rPr>
+        <w:drawing>
+          <wp:inline distT="0" distB="0" distL="0" distR="0" wp14:anchorId="3D171B6E" wp14:editId="46C82569">
+            <wp:extent cx="5400040" cy="3085465"/>
+            <wp:effectExtent l="0" t="0" r="0" b="635"/>
+            <wp:docPr id="1843124130" name="Imagem 1" descr="Gráfico&#10;&#10;Descrição gerada automaticamente"/>
+            <wp:cNvGraphicFramePr>
+              <a:graphicFrameLocks xmlns:a="http://schemas.openxmlformats.org/drawingml/2006/main" noChangeAspect="1"/>
+            </wp:cNvGraphicFramePr>
+            <a:graphic xmlns:a="http://schemas.openxmlformats.org/drawingml/2006/main">
+              <a:graphicData uri="http://schemas.openxmlformats.org/drawingml/2006/picture">
+                <pic:pic xmlns:pic="http://schemas.openxmlformats.org/drawingml/2006/picture">
+                  <pic:nvPicPr>
+                    <pic:cNvPr id="1159395290" name="Imagem 1" descr="Gráfico&#10;&#10;Descrição gerada automaticamente"/>
+                    <pic:cNvPicPr/>
+                  </pic:nvPicPr>
+                  <pic:blipFill>
+                    <a:blip r:embed="rId10"/>
+                    <a:stretch>
+                      <a:fillRect/>
+                    </a:stretch>
+                  </pic:blipFill>
+                  <pic:spPr>
+                    <a:xfrm>
+                      <a:off x="0" y="0"/>
+                      <a:ext cx="5400040" cy="3085465"/>
                     </a:xfrm>
                     <a:prstGeom prst="rect">
                       <a:avLst/>

</xml_diff>